<commit_message>
Thêm tài liệu Refactor pha 1
Thêm tài liệu: 0. Docs all
</commit_message>
<xml_diff>
--- a/Mô tả/0. ShinCrm v21.1 - Cấu trúc sidebar.docx
+++ b/Mô tả/0. ShinCrm v21.1 - Cấu trúc sidebar.docx
@@ -526,15 +526,16 @@
           <w:rFonts w:ascii="Aptos Display" w:hAnsi="Aptos Display"/>
           <w:sz w:val="24"/>
           <w:szCs w:val="24"/>
-        </w:rPr>
-      </w:pPr>
-      <w:r>
-        <w:rPr>
-          <w:rFonts w:ascii="Aptos Display" w:hAnsi="Aptos Display"/>
-          <w:sz w:val="24"/>
-          <w:szCs w:val="24"/>
-        </w:rPr>
-        <w:t>Địa chỉ (*) (Địa chỉ bắt buộc nhập, ngầm định địa chỉ là HNI)</w:t>
+          <w:lang w:val="en-US"/>
+        </w:rPr>
+      </w:pPr>
+      <w:r>
+        <w:rPr>
+          <w:rFonts w:ascii="Aptos Display" w:hAnsi="Aptos Display"/>
+          <w:sz w:val="24"/>
+          <w:szCs w:val="24"/>
+        </w:rPr>
+        <w:t>Địa chỉ (*)</w:t>
       </w:r>
     </w:p>
     <w:p>

</xml_diff>